<commit_message>
fix: correct semester ISP Word formatting v1.6.1
</commit_message>
<xml_diff>
--- a/templates/semester-isp-template.docx
+++ b/templates/semester-isp-template.docx
@@ -15,9 +15,9 @@
       </w:pPr>
       <w:r>
         <w:rPr>
-          <w:rFonts w:ascii="Century Gothic" w:eastAsia="標楷體"/>
+          <w:rFonts w:ascii="DFKai-SB" w:eastAsia="標楷體" w:hAnsi="DFKai-SB"/>
           <w:b/>
-          <w:sz w:val="32"/>
+          <w:sz w:val="24"/>
           <w:szCs w:val="32"/>
           <w:u w:val="single"/>
         </w:rPr>
@@ -38,7 +38,8 @@
       </w:pPr>
       <w:r>
         <w:rPr>
-          <w:rFonts w:ascii="標楷體" w:eastAsia="標楷體" w:hAnsi="標楷體" w:hint="eastAsia"/>
+          <w:rFonts w:ascii="DFKai-SB" w:eastAsia="標楷體" w:hAnsi="DFKai-SB" w:hint="eastAsia"/>
+          <w:sz w:val="24"/>
         </w:rPr>
         <w:t>日期：{fillDateText}</w:t>
       </w:r>
@@ -104,8 +105,9 @@
             </w:pPr>
             <w:r>
               <w:rPr>
-                <w:rFonts w:ascii="標楷體" w:eastAsia="標楷體" w:hAnsi="標楷體" w:hint="eastAsia"/>
+                <w:rFonts w:ascii="DFKai-SB" w:eastAsia="標楷體" w:hAnsi="DFKai-SB" w:hint="eastAsia"/>
                 <w:b/>
+                <w:sz w:val="24"/>
               </w:rPr>
               <w:t>系級</w:t>
             </w:r>
@@ -135,6 +137,10 @@
               </w:rPr>
             </w:pPr>
             <w:r>
+              <w:rPr>
+                <w:rFonts w:ascii="DFKai-SB" w:hAnsi="DFKai-SB" w:eastAsia="標楷體"/>
+                <w:sz w:val="24"/>
+              </w:rPr>
               <w:t>{department}{studentClass}</w:t>
             </w:r>
           </w:p>
@@ -163,8 +169,9 @@
             </w:pPr>
             <w:r>
               <w:rPr>
-                <w:rFonts w:ascii="標楷體" w:eastAsia="標楷體" w:hAnsi="標楷體" w:hint="eastAsia"/>
+                <w:rFonts w:ascii="DFKai-SB" w:eastAsia="標楷體" w:hAnsi="DFKai-SB" w:hint="eastAsia"/>
                 <w:b/>
+                <w:sz w:val="24"/>
               </w:rPr>
               <w:t>姓名</w:t>
             </w:r>
@@ -193,6 +200,10 @@
               </w:rPr>
             </w:pPr>
             <w:r>
+              <w:rPr>
+                <w:rFonts w:ascii="DFKai-SB" w:hAnsi="DFKai-SB" w:eastAsia="標楷體"/>
+                <w:sz w:val="24"/>
+              </w:rPr>
               <w:t>{studentName}</w:t>
             </w:r>
           </w:p>
@@ -229,15 +240,17 @@
             </w:pPr>
             <w:r>
               <w:rPr>
-                <w:rFonts w:ascii="標楷體" w:eastAsia="標楷體" w:hAnsi="標楷體" w:hint="eastAsia"/>
+                <w:rFonts w:ascii="DFKai-SB" w:eastAsia="標楷體" w:hAnsi="DFKai-SB" w:hint="eastAsia"/>
                 <w:b/>
+                <w:sz w:val="24"/>
               </w:rPr>
               <w:t>障</w:t>
             </w:r>
             <w:r>
               <w:rPr>
-                <w:rFonts w:ascii="標楷體" w:eastAsia="標楷體" w:hAnsi="標楷體" w:hint="eastAsia"/>
+                <w:rFonts w:ascii="DFKai-SB" w:eastAsia="標楷體" w:hAnsi="DFKai-SB" w:hint="eastAsia"/>
                 <w:b/>
+                <w:sz w:val="24"/>
               </w:rPr>
               <w:t>別</w:t>
             </w:r>
@@ -267,6 +280,10 @@
               </w:rPr>
             </w:pPr>
             <w:r>
+              <w:rPr>
+                <w:rFonts w:ascii="DFKai-SB" w:hAnsi="DFKai-SB" w:eastAsia="標楷體"/>
+                <w:sz w:val="24"/>
+              </w:rPr>
               <w:t>{disabilityType}</w:t>
             </w:r>
           </w:p>
@@ -295,8 +312,9 @@
             </w:pPr>
             <w:r>
               <w:rPr>
-                <w:rFonts w:ascii="標楷體" w:eastAsia="標楷體" w:hAnsi="標楷體" w:hint="eastAsia"/>
+                <w:rFonts w:ascii="DFKai-SB" w:eastAsia="標楷體" w:hAnsi="DFKai-SB" w:hint="eastAsia"/>
                 <w:b/>
+                <w:sz w:val="24"/>
               </w:rPr>
               <w:t>程度</w:t>
             </w:r>
@@ -325,6 +343,10 @@
               </w:rPr>
             </w:pPr>
             <w:r>
+              <w:rPr>
+                <w:rFonts w:ascii="DFKai-SB" w:hAnsi="DFKai-SB" w:eastAsia="標楷體"/>
+                <w:sz w:val="24"/>
+              </w:rPr>
               <w:t>{disabilityLevel}</w:t>
             </w:r>
           </w:p>
@@ -358,7 +380,8 @@
             </w:pPr>
             <w:r>
               <w:rPr>
-                <w:rFonts w:ascii="標楷體" w:eastAsia="標楷體" w:hAnsi="標楷體" w:hint="eastAsia"/>
+                <w:rFonts w:ascii="DFKai-SB" w:eastAsia="標楷體" w:hAnsi="DFKai-SB" w:hint="eastAsia"/>
+                <w:sz w:val="24"/>
               </w:rPr>
               <w:t>學生期初評估與情況描述</w:t>
             </w:r>
@@ -388,7 +411,8 @@
             </w:pPr>
             <w:r>
               <w:rPr>
-                <w:rFonts w:ascii="標楷體" w:eastAsia="標楷體" w:hAnsi="標楷體" w:hint="eastAsia"/>
+                <w:rFonts w:ascii="DFKai-SB" w:eastAsia="標楷體" w:hAnsi="DFKai-SB" w:hint="eastAsia"/>
+                <w:sz w:val="24"/>
               </w:rPr>
               <w:t>項目</w:t>
             </w:r>
@@ -419,14 +443,16 @@
             </w:pPr>
             <w:r>
               <w:rPr>
-                <w:rFonts w:ascii="標楷體" w:eastAsia="標楷體" w:hAnsi="標楷體" w:hint="eastAsia"/>
+                <w:rFonts w:ascii="DFKai-SB" w:eastAsia="標楷體" w:hAnsi="DFKai-SB" w:hint="eastAsia"/>
+                <w:sz w:val="24"/>
                 <w:shd w:val="clear" w:color="auto" w:fill="D9D9D9" w:themeFill="background1" w:themeFillShade="D9"/>
               </w:rPr>
               <w:t>內</w:t>
             </w:r>
             <w:r>
               <w:rPr>
-                <w:rFonts w:ascii="標楷體" w:eastAsia="標楷體" w:hAnsi="標楷體" w:hint="eastAsia"/>
+                <w:rFonts w:ascii="DFKai-SB" w:eastAsia="標楷體" w:hAnsi="DFKai-SB" w:hint="eastAsia"/>
+                <w:sz w:val="24"/>
               </w:rPr>
               <w:t>容</w:t>
             </w:r>
@@ -484,7 +510,8 @@
             </w:pPr>
             <w:r>
               <w:rPr>
-                <w:rFonts w:ascii="標楷體" w:eastAsia="標楷體" w:hAnsi="標楷體" w:hint="eastAsia"/>
+                <w:rFonts w:ascii="DFKai-SB" w:eastAsia="標楷體" w:hAnsi="DFKai-SB" w:hint="eastAsia"/>
+                <w:sz w:val="24"/>
               </w:rPr>
               <w:t>學生能力</w:t>
             </w:r>
@@ -500,7 +527,8 @@
             </w:pPr>
             <w:r>
               <w:rPr>
-                <w:rFonts w:ascii="標楷體" w:eastAsia="標楷體" w:hAnsi="標楷體" w:hint="eastAsia"/>
+                <w:rFonts w:ascii="DFKai-SB" w:eastAsia="標楷體" w:hAnsi="DFKai-SB" w:hint="eastAsia"/>
+                <w:sz w:val="24"/>
               </w:rPr>
               <w:t>現況</w:t>
             </w:r>
@@ -528,13 +556,15 @@
             </w:pPr>
             <w:r>
               <w:rPr>
-                <w:rFonts w:ascii="標楷體" w:eastAsia="標楷體" w:hAnsi="標楷體" w:hint="eastAsia"/>
+                <w:rFonts w:ascii="DFKai-SB" w:eastAsia="標楷體" w:hAnsi="DFKai-SB" w:hint="eastAsia"/>
+                <w:sz w:val="24"/>
               </w:rPr>
               <w:t>健</w:t>
             </w:r>
             <w:r>
               <w:rPr>
-                <w:rFonts w:ascii="標楷體" w:eastAsia="標楷體" w:hAnsi="標楷體"/>
+                <w:rFonts w:ascii="DFKai-SB" w:eastAsia="標楷體" w:hAnsi="DFKai-SB"/>
+                <w:sz w:val="24"/>
               </w:rPr>
               <w:t>康狀況</w:t>
             </w:r>
@@ -558,6 +588,10 @@
               </w:rPr>
             </w:pPr>
             <w:r>
+              <w:rPr>
+                <w:rFonts w:ascii="DFKai-SB" w:hAnsi="DFKai-SB" w:eastAsia="標楷體"/>
+                <w:sz w:val="24"/>
+              </w:rPr>
               <w:t>{abilityHealth}</w:t>
             </w:r>
           </w:p>
@@ -633,13 +667,15 @@
             </w:pPr>
             <w:r>
               <w:rPr>
-                <w:rFonts w:ascii="標楷體" w:eastAsia="標楷體" w:hAnsi="標楷體" w:hint="eastAsia"/>
+                <w:rFonts w:ascii="DFKai-SB" w:eastAsia="標楷體" w:hAnsi="DFKai-SB" w:hint="eastAsia"/>
+                <w:sz w:val="24"/>
               </w:rPr>
               <w:t>感官</w:t>
             </w:r>
             <w:r>
               <w:rPr>
-                <w:rFonts w:ascii="標楷體" w:eastAsia="標楷體" w:hAnsi="標楷體"/>
+                <w:rFonts w:ascii="DFKai-SB" w:eastAsia="標楷體" w:hAnsi="DFKai-SB"/>
+                <w:sz w:val="24"/>
               </w:rPr>
               <w:t>功能</w:t>
             </w:r>
@@ -664,6 +700,10 @@
               </w:rPr>
             </w:pPr>
             <w:r>
+              <w:rPr>
+                <w:rFonts w:ascii="DFKai-SB" w:hAnsi="DFKai-SB" w:eastAsia="標楷體"/>
+                <w:sz w:val="24"/>
+              </w:rPr>
               <w:t>{abilitySensory}</w:t>
             </w:r>
           </w:p>
@@ -739,13 +779,15 @@
             </w:pPr>
             <w:r>
               <w:rPr>
-                <w:rFonts w:ascii="標楷體" w:eastAsia="標楷體" w:hAnsi="標楷體" w:hint="eastAsia"/>
+                <w:rFonts w:ascii="DFKai-SB" w:eastAsia="標楷體" w:hAnsi="DFKai-SB" w:hint="eastAsia"/>
+                <w:sz w:val="24"/>
               </w:rPr>
               <w:t>知</w:t>
             </w:r>
             <w:r>
               <w:rPr>
-                <w:rFonts w:ascii="標楷體" w:eastAsia="標楷體" w:hAnsi="標楷體"/>
+                <w:rFonts w:ascii="DFKai-SB" w:eastAsia="標楷體" w:hAnsi="DFKai-SB"/>
+                <w:sz w:val="24"/>
               </w:rPr>
               <w:t>覺動作</w:t>
             </w:r>
@@ -770,6 +812,10 @@
               </w:rPr>
             </w:pPr>
             <w:r>
+              <w:rPr>
+                <w:rFonts w:ascii="DFKai-SB" w:hAnsi="DFKai-SB" w:eastAsia="標楷體"/>
+                <w:sz w:val="24"/>
+              </w:rPr>
               <w:t>{abilityMotor}</w:t>
             </w:r>
           </w:p>
@@ -845,13 +891,15 @@
             </w:pPr>
             <w:r>
               <w:rPr>
-                <w:rFonts w:ascii="標楷體" w:eastAsia="標楷體" w:hAnsi="標楷體" w:hint="eastAsia"/>
+                <w:rFonts w:ascii="DFKai-SB" w:eastAsia="標楷體" w:hAnsi="DFKai-SB" w:hint="eastAsia"/>
+                <w:sz w:val="24"/>
               </w:rPr>
               <w:t>認</w:t>
             </w:r>
             <w:r>
               <w:rPr>
-                <w:rFonts w:ascii="標楷體" w:eastAsia="標楷體" w:hAnsi="標楷體"/>
+                <w:rFonts w:ascii="DFKai-SB" w:eastAsia="標楷體" w:hAnsi="DFKai-SB"/>
+                <w:sz w:val="24"/>
               </w:rPr>
               <w:t>知能力</w:t>
             </w:r>
@@ -876,6 +924,10 @@
               </w:rPr>
             </w:pPr>
             <w:r>
+              <w:rPr>
+                <w:rFonts w:ascii="DFKai-SB" w:hAnsi="DFKai-SB" w:eastAsia="標楷體"/>
+                <w:sz w:val="24"/>
+              </w:rPr>
               <w:t>{abilityCognitive}</w:t>
             </w:r>
           </w:p>
@@ -951,13 +1003,15 @@
             </w:pPr>
             <w:r>
               <w:rPr>
-                <w:rFonts w:ascii="標楷體" w:eastAsia="標楷體" w:hAnsi="標楷體" w:hint="eastAsia"/>
+                <w:rFonts w:ascii="DFKai-SB" w:eastAsia="標楷體" w:hAnsi="DFKai-SB" w:hint="eastAsia"/>
+                <w:sz w:val="24"/>
               </w:rPr>
               <w:t>溝</w:t>
             </w:r>
             <w:r>
               <w:rPr>
-                <w:rFonts w:ascii="標楷體" w:eastAsia="標楷體" w:hAnsi="標楷體"/>
+                <w:rFonts w:ascii="DFKai-SB" w:eastAsia="標楷體" w:hAnsi="DFKai-SB"/>
+                <w:sz w:val="24"/>
               </w:rPr>
               <w:t>通能力</w:t>
             </w:r>
@@ -982,6 +1036,10 @@
               </w:rPr>
             </w:pPr>
             <w:r>
+              <w:rPr>
+                <w:rFonts w:ascii="DFKai-SB" w:hAnsi="DFKai-SB" w:eastAsia="標楷體"/>
+                <w:sz w:val="24"/>
+              </w:rPr>
               <w:t>{abilityCommunication}</w:t>
             </w:r>
           </w:p>
@@ -1057,13 +1115,15 @@
             </w:pPr>
             <w:r>
               <w:rPr>
-                <w:rFonts w:ascii="標楷體" w:eastAsia="標楷體" w:hAnsi="標楷體" w:hint="eastAsia"/>
+                <w:rFonts w:ascii="DFKai-SB" w:eastAsia="標楷體" w:hAnsi="DFKai-SB" w:hint="eastAsia"/>
+                <w:sz w:val="24"/>
               </w:rPr>
               <w:t>學</w:t>
             </w:r>
             <w:r>
               <w:rPr>
-                <w:rFonts w:ascii="標楷體" w:eastAsia="標楷體" w:hAnsi="標楷體"/>
+                <w:rFonts w:ascii="DFKai-SB" w:eastAsia="標楷體" w:hAnsi="DFKai-SB"/>
+                <w:sz w:val="24"/>
               </w:rPr>
               <w:t>業能力</w:t>
             </w:r>
@@ -1088,6 +1148,10 @@
               </w:rPr>
             </w:pPr>
             <w:r>
+              <w:rPr>
+                <w:rFonts w:ascii="DFKai-SB" w:hAnsi="DFKai-SB" w:eastAsia="標楷體"/>
+                <w:sz w:val="24"/>
+              </w:rPr>
               <w:t>{abilityAcademic}</w:t>
             </w:r>
           </w:p>
@@ -1163,13 +1227,15 @@
             </w:pPr>
             <w:r>
               <w:rPr>
-                <w:rFonts w:ascii="標楷體" w:eastAsia="標楷體" w:hAnsi="標楷體" w:hint="eastAsia"/>
+                <w:rFonts w:ascii="DFKai-SB" w:eastAsia="標楷體" w:hAnsi="DFKai-SB" w:hint="eastAsia"/>
+                <w:sz w:val="24"/>
               </w:rPr>
               <w:t>生</w:t>
             </w:r>
             <w:r>
               <w:rPr>
-                <w:rFonts w:ascii="標楷體" w:eastAsia="標楷體" w:hAnsi="標楷體"/>
+                <w:rFonts w:ascii="DFKai-SB" w:eastAsia="標楷體" w:hAnsi="DFKai-SB"/>
+                <w:sz w:val="24"/>
               </w:rPr>
               <w:t>活自理能力</w:t>
             </w:r>
@@ -1194,6 +1260,10 @@
               </w:rPr>
             </w:pPr>
             <w:r>
+              <w:rPr>
+                <w:rFonts w:ascii="DFKai-SB" w:hAnsi="DFKai-SB" w:eastAsia="標楷體"/>
+                <w:sz w:val="24"/>
+              </w:rPr>
               <w:t>{abilitySelfCare}</w:t>
             </w:r>
           </w:p>
@@ -1270,13 +1340,15 @@
             </w:pPr>
             <w:r>
               <w:rPr>
-                <w:rFonts w:ascii="標楷體" w:eastAsia="標楷體" w:hAnsi="標楷體" w:hint="eastAsia"/>
+                <w:rFonts w:ascii="DFKai-SB" w:eastAsia="標楷體" w:hAnsi="DFKai-SB" w:hint="eastAsia"/>
+                <w:sz w:val="24"/>
               </w:rPr>
               <w:t>社</w:t>
             </w:r>
             <w:r>
               <w:rPr>
-                <w:rFonts w:ascii="標楷體" w:eastAsia="標楷體" w:hAnsi="標楷體"/>
+                <w:rFonts w:ascii="DFKai-SB" w:eastAsia="標楷體" w:hAnsi="DFKai-SB"/>
+                <w:sz w:val="24"/>
               </w:rPr>
               <w:t>會化及</w:t>
             </w:r>
@@ -1292,19 +1364,22 @@
             </w:pPr>
             <w:r>
               <w:rPr>
-                <w:rFonts w:ascii="標楷體" w:eastAsia="標楷體" w:hAnsi="標楷體"/>
+                <w:rFonts w:ascii="DFKai-SB" w:eastAsia="標楷體" w:hAnsi="DFKai-SB"/>
+                <w:sz w:val="24"/>
               </w:rPr>
               <w:t>情緒</w:t>
             </w:r>
             <w:r>
               <w:rPr>
-                <w:rFonts w:ascii="標楷體" w:eastAsia="標楷體" w:hAnsi="標楷體" w:hint="eastAsia"/>
+                <w:rFonts w:ascii="DFKai-SB" w:eastAsia="標楷體" w:hAnsi="DFKai-SB" w:hint="eastAsia"/>
+                <w:sz w:val="24"/>
               </w:rPr>
               <w:t>行</w:t>
             </w:r>
             <w:r>
               <w:rPr>
-                <w:rFonts w:ascii="標楷體" w:eastAsia="標楷體" w:hAnsi="標楷體"/>
+                <w:rFonts w:ascii="DFKai-SB" w:eastAsia="標楷體" w:hAnsi="DFKai-SB"/>
+                <w:sz w:val="24"/>
               </w:rPr>
               <w:t>為能力</w:t>
             </w:r>
@@ -1329,6 +1404,10 @@
               </w:rPr>
             </w:pPr>
             <w:r>
+              <w:rPr>
+                <w:rFonts w:ascii="DFKai-SB" w:hAnsi="DFKai-SB" w:eastAsia="標楷體"/>
+                <w:sz w:val="24"/>
+              </w:rPr>
               <w:t>{abilitySocialEmotional}</w:t>
             </w:r>
           </w:p>
@@ -1384,13 +1463,15 @@
             </w:pPr>
             <w:r>
               <w:rPr>
-                <w:rFonts w:ascii="標楷體" w:eastAsia="標楷體" w:hAnsi="標楷體" w:hint="eastAsia"/>
+                <w:rFonts w:ascii="DFKai-SB" w:eastAsia="標楷體" w:hAnsi="DFKai-SB" w:hint="eastAsia"/>
+                <w:sz w:val="24"/>
               </w:rPr>
               <w:t>綜合</w:t>
             </w:r>
             <w:r>
               <w:rPr>
-                <w:rFonts w:ascii="標楷體" w:eastAsia="標楷體" w:hAnsi="標楷體"/>
+                <w:rFonts w:ascii="DFKai-SB" w:eastAsia="標楷體" w:hAnsi="DFKai-SB"/>
+                <w:sz w:val="24"/>
               </w:rPr>
               <w:t>評估</w:t>
             </w:r>
@@ -1407,25 +1488,29 @@
             </w:pPr>
             <w:r>
               <w:rPr>
-                <w:rFonts w:ascii="標楷體" w:eastAsia="標楷體" w:hAnsi="標楷體" w:hint="eastAsia"/>
+                <w:rFonts w:ascii="DFKai-SB" w:eastAsia="標楷體" w:hAnsi="DFKai-SB" w:hint="eastAsia"/>
+                <w:sz w:val="24"/>
               </w:rPr>
               <w:t>學</w:t>
             </w:r>
             <w:r>
               <w:rPr>
-                <w:rFonts w:ascii="標楷體" w:eastAsia="標楷體" w:hAnsi="標楷體"/>
+                <w:rFonts w:ascii="DFKai-SB" w:eastAsia="標楷體" w:hAnsi="DFKai-SB"/>
+                <w:sz w:val="24"/>
               </w:rPr>
               <w:t>生優</w:t>
             </w:r>
             <w:r>
               <w:rPr>
-                <w:rFonts w:ascii="標楷體" w:eastAsia="標楷體" w:hAnsi="標楷體" w:hint="eastAsia"/>
+                <w:rFonts w:ascii="DFKai-SB" w:eastAsia="標楷體" w:hAnsi="DFKai-SB" w:hint="eastAsia"/>
+                <w:sz w:val="24"/>
               </w:rPr>
               <w:t>弱</w:t>
             </w:r>
             <w:r>
               <w:rPr>
-                <w:rFonts w:ascii="標楷體" w:eastAsia="標楷體" w:hAnsi="標楷體"/>
+                <w:rFonts w:ascii="DFKai-SB" w:eastAsia="標楷體" w:hAnsi="DFKai-SB"/>
+                <w:sz w:val="24"/>
               </w:rPr>
               <w:t>勢能力</w:t>
             </w:r>
@@ -1446,8 +1531,8 @@
           </w:tcPr>
           <w:p>
             <w:pPr>
-              <w:spacing w:line="400" w:lineRule="exact"/>
-              <w:ind w:left="32"/>
+              <w:spacing w:line="400" w:lineRule="exact" w:before="0" w:after="0"/>
+              <w:ind w:left="0" w:firstLine="0"/>
               <w:jc w:val="both"/>
               <w:rPr>
                 <w:rFonts w:ascii="標楷體" w:eastAsia="標楷體" w:hAnsi="標楷體"/>
@@ -1455,337 +1540,10 @@
             </w:pPr>
             <w:r>
               <w:rPr>
-                <w:rFonts w:ascii="標楷體" w:eastAsia="標楷體" w:hAnsi="標楷體" w:hint="eastAsia"/>
+                <w:rFonts w:ascii="DFKai-SB" w:eastAsia="標楷體" w:hAnsi="DFKai-SB" w:hint="eastAsia"/>
+                <w:sz w:val="24"/>
               </w:rPr>
               <w:t>{strengthBlock}</w:t>
-            </w:r>
-          </w:p>
-          <w:p>
-            <w:pPr>
-              <w:spacing w:line="400" w:lineRule="exact"/>
-              <w:ind w:left="32"/>
-              <w:jc w:val="both"/>
-              <w:rPr>
-                <w:rFonts w:ascii="標楷體" w:eastAsia="標楷體" w:hAnsi="標楷體"/>
-              </w:rPr>
-            </w:pPr>
-            <w:r>
-              <w:rPr>
-                <w:rFonts w:ascii="標楷體" w:eastAsia="標楷體" w:hAnsi="標楷體" w:hint="eastAsia"/>
-              </w:rPr>
-              <w:t xml:space="preserve">(2)情緒控制能力　    </w:t>
-            </w:r>
-            <w:r>
-              <w:rPr>
-                <w:rFonts w:ascii="標楷體" w:eastAsia="標楷體" w:hAnsi="標楷體" w:hint="eastAsia"/>
-              </w:rPr>
-              <w:t xml:space="preserve">    </w:t>
-            </w:r>
-            <w:r>
-              <w:rPr>
-                <w:rFonts w:ascii="標楷體" w:eastAsia="標楷體" w:hAnsi="標楷體" w:hint="eastAsia"/>
-              </w:rPr>
-              <w:t xml:space="preserve"> </w:t>
-            </w:r>
-            <w:r>
-              <w:rPr>
-                <w:rFonts w:ascii="標楷體" w:eastAsia="標楷體" w:hAnsi="標楷體" w:hint="eastAsia"/>
-              </w:rPr>
-              <w:t xml:space="preserve"> </w:t>
-            </w:r>
-            <w:r>
-              <w:rPr>
-                <w:rFonts w:ascii="標楷體" w:eastAsia="標楷體" w:hAnsi="標楷體" w:hint="eastAsia"/>
-              </w:rPr>
-              <w:t>□</w:t>
-            </w:r>
-            <w:r>
-              <w:rPr>
-                <w:rFonts w:ascii="標楷體" w:eastAsia="標楷體" w:hAnsi="標楷體" w:hint="eastAsia"/>
-              </w:rPr>
-              <w:t>良好</w:t>
-            </w:r>
-            <w:r>
-              <w:rPr>
-                <w:rFonts w:ascii="標楷體" w:eastAsia="標楷體" w:hAnsi="標楷體" w:hint="eastAsia"/>
-              </w:rPr>
-              <w:t>□</w:t>
-            </w:r>
-            <w:r>
-              <w:rPr>
-                <w:rFonts w:ascii="標楷體" w:eastAsia="標楷體" w:hAnsi="標楷體" w:hint="eastAsia"/>
-              </w:rPr>
-              <w:t>尚可□差</w:t>
-            </w:r>
-          </w:p>
-          <w:p>
-            <w:pPr>
-              <w:spacing w:line="400" w:lineRule="exact"/>
-              <w:ind w:left="32"/>
-              <w:jc w:val="both"/>
-              <w:rPr>
-                <w:rFonts w:ascii="標楷體" w:eastAsia="標楷體" w:hAnsi="標楷體"/>
-              </w:rPr>
-            </w:pPr>
-            <w:r>
-              <w:rPr>
-                <w:rFonts w:ascii="標楷體" w:eastAsia="標楷體" w:hAnsi="標楷體" w:hint="eastAsia"/>
-              </w:rPr>
-              <w:t xml:space="preserve">(3)個人疾病認識能力　 </w:t>
-            </w:r>
-            <w:r>
-              <w:rPr>
-                <w:rFonts w:ascii="標楷體" w:eastAsia="標楷體" w:hAnsi="標楷體" w:hint="eastAsia"/>
-              </w:rPr>
-              <w:t xml:space="preserve">     </w:t>
-            </w:r>
-            <w:r>
-              <w:rPr>
-                <w:rFonts w:ascii="標楷體" w:eastAsia="標楷體" w:hAnsi="標楷體" w:hint="eastAsia"/>
-              </w:rPr>
-              <w:t>□</w:t>
-            </w:r>
-            <w:r>
-              <w:rPr>
-                <w:rFonts w:ascii="標楷體" w:eastAsia="標楷體" w:hAnsi="標楷體" w:hint="eastAsia"/>
-              </w:rPr>
-              <w:t>良好</w:t>
-            </w:r>
-            <w:r>
-              <w:rPr>
-                <w:rFonts w:ascii="標楷體" w:eastAsia="標楷體" w:hAnsi="標楷體" w:hint="eastAsia"/>
-              </w:rPr>
-              <w:t>□</w:t>
-            </w:r>
-            <w:r>
-              <w:rPr>
-                <w:rFonts w:ascii="標楷體" w:eastAsia="標楷體" w:hAnsi="標楷體" w:hint="eastAsia"/>
-              </w:rPr>
-              <w:t>尚可□差</w:t>
-            </w:r>
-          </w:p>
-          <w:p>
-            <w:pPr>
-              <w:spacing w:line="400" w:lineRule="exact"/>
-              <w:ind w:left="32"/>
-              <w:jc w:val="both"/>
-              <w:rPr>
-                <w:rFonts w:ascii="標楷體" w:eastAsia="標楷體" w:hAnsi="標楷體"/>
-              </w:rPr>
-            </w:pPr>
-            <w:r>
-              <w:rPr>
-                <w:rFonts w:ascii="標楷體" w:eastAsia="標楷體" w:hAnsi="標楷體" w:hint="eastAsia"/>
-              </w:rPr>
-              <w:t xml:space="preserve">(4)解決問題及處理狀況能力　</w:t>
-            </w:r>
-            <w:r>
-              <w:rPr>
-                <w:rFonts w:ascii="標楷體" w:eastAsia="標楷體" w:hAnsi="標楷體" w:hint="eastAsia"/>
-              </w:rPr>
-              <w:t>□</w:t>
-            </w:r>
-            <w:r>
-              <w:rPr>
-                <w:rFonts w:ascii="標楷體" w:eastAsia="標楷體" w:hAnsi="標楷體" w:hint="eastAsia"/>
-              </w:rPr>
-              <w:t>良好</w:t>
-            </w:r>
-            <w:r>
-              <w:rPr>
-                <w:rFonts w:ascii="標楷體" w:eastAsia="標楷體" w:hAnsi="標楷體" w:hint="eastAsia"/>
-              </w:rPr>
-              <w:t>□</w:t>
-            </w:r>
-            <w:r>
-              <w:rPr>
-                <w:rFonts w:ascii="標楷體" w:eastAsia="標楷體" w:hAnsi="標楷體" w:hint="eastAsia"/>
-              </w:rPr>
-              <w:t>尚可□差</w:t>
-            </w:r>
-          </w:p>
-          <w:p>
-            <w:pPr>
-              <w:spacing w:line="400" w:lineRule="exact"/>
-              <w:ind w:left="32"/>
-              <w:jc w:val="both"/>
-              <w:rPr>
-                <w:rFonts w:ascii="標楷體" w:eastAsia="標楷體" w:hAnsi="標楷體"/>
-              </w:rPr>
-            </w:pPr>
-            <w:r>
-              <w:rPr>
-                <w:rFonts w:ascii="標楷體" w:eastAsia="標楷體" w:hAnsi="標楷體" w:hint="eastAsia"/>
-              </w:rPr>
-              <w:t xml:space="preserve">(5)尋求資源能力　     </w:t>
-            </w:r>
-            <w:r>
-              <w:rPr>
-                <w:rFonts w:ascii="標楷體" w:eastAsia="標楷體" w:hAnsi="標楷體" w:hint="eastAsia"/>
-              </w:rPr>
-              <w:t xml:space="preserve">     </w:t>
-            </w:r>
-            <w:r>
-              <w:rPr>
-                <w:rFonts w:ascii="標楷體" w:eastAsia="標楷體" w:hAnsi="標楷體" w:hint="eastAsia"/>
-              </w:rPr>
-              <w:t>□</w:t>
-            </w:r>
-            <w:r>
-              <w:rPr>
-                <w:rFonts w:ascii="標楷體" w:eastAsia="標楷體" w:hAnsi="標楷體" w:hint="eastAsia"/>
-              </w:rPr>
-              <w:t>良好</w:t>
-            </w:r>
-            <w:r>
-              <w:rPr>
-                <w:rFonts w:ascii="標楷體" w:eastAsia="標楷體" w:hAnsi="標楷體" w:hint="eastAsia"/>
-              </w:rPr>
-              <w:t>□</w:t>
-            </w:r>
-            <w:r>
-              <w:rPr>
-                <w:rFonts w:ascii="標楷體" w:eastAsia="標楷體" w:hAnsi="標楷體" w:hint="eastAsia"/>
-              </w:rPr>
-              <w:t>尚可□差</w:t>
-            </w:r>
-          </w:p>
-          <w:p>
-            <w:pPr>
-              <w:spacing w:line="400" w:lineRule="exact"/>
-              <w:ind w:left="32"/>
-              <w:jc w:val="both"/>
-              <w:rPr>
-                <w:rFonts w:ascii="標楷體" w:eastAsia="標楷體" w:hAnsi="標楷體"/>
-              </w:rPr>
-            </w:pPr>
-            <w:r>
-              <w:rPr>
-                <w:rFonts w:ascii="標楷體" w:eastAsia="標楷體" w:hAnsi="標楷體" w:hint="eastAsia"/>
-              </w:rPr>
-              <w:t xml:space="preserve">(6)支持系統資源　     </w:t>
-            </w:r>
-            <w:r>
-              <w:rPr>
-                <w:rFonts w:ascii="標楷體" w:eastAsia="標楷體" w:hAnsi="標楷體" w:hint="eastAsia"/>
-              </w:rPr>
-              <w:t xml:space="preserve">     </w:t>
-            </w:r>
-            <w:r>
-              <w:rPr>
-                <w:rFonts w:ascii="標楷體" w:eastAsia="標楷體" w:hAnsi="標楷體" w:hint="eastAsia"/>
-              </w:rPr>
-              <w:t>□</w:t>
-            </w:r>
-            <w:r>
-              <w:rPr>
-                <w:rFonts w:ascii="標楷體" w:eastAsia="標楷體" w:hAnsi="標楷體" w:hint="eastAsia"/>
-              </w:rPr>
-              <w:t>良好</w:t>
-            </w:r>
-            <w:r>
-              <w:rPr>
-                <w:rFonts w:ascii="標楷體" w:eastAsia="標楷體" w:hAnsi="標楷體" w:hint="eastAsia"/>
-              </w:rPr>
-              <w:t>□</w:t>
-            </w:r>
-            <w:r>
-              <w:rPr>
-                <w:rFonts w:ascii="標楷體" w:eastAsia="標楷體" w:hAnsi="標楷體" w:hint="eastAsia"/>
-              </w:rPr>
-              <w:t>尚可□差</w:t>
-            </w:r>
-          </w:p>
-          <w:p>
-            <w:pPr>
-              <w:spacing w:line="400" w:lineRule="exact"/>
-              <w:ind w:left="32"/>
-              <w:jc w:val="both"/>
-              <w:rPr>
-                <w:rFonts w:ascii="標楷體" w:eastAsia="標楷體" w:hAnsi="標楷體"/>
-              </w:rPr>
-            </w:pPr>
-            <w:r>
-              <w:rPr>
-                <w:rFonts w:ascii="標楷體" w:eastAsia="標楷體" w:hAnsi="標楷體" w:hint="eastAsia"/>
-              </w:rPr>
-              <w:t xml:space="preserve">(7)家人的互動與關懷　 </w:t>
-            </w:r>
-            <w:r>
-              <w:rPr>
-                <w:rFonts w:ascii="標楷體" w:eastAsia="標楷體" w:hAnsi="標楷體" w:hint="eastAsia"/>
-              </w:rPr>
-              <w:t xml:space="preserve">     </w:t>
-            </w:r>
-            <w:r>
-              <w:rPr>
-                <w:rFonts w:ascii="標楷體" w:eastAsia="標楷體" w:hAnsi="標楷體" w:hint="eastAsia"/>
-              </w:rPr>
-              <w:t>□</w:t>
-            </w:r>
-            <w:r>
-              <w:rPr>
-                <w:rFonts w:ascii="標楷體" w:eastAsia="標楷體" w:hAnsi="標楷體" w:hint="eastAsia"/>
-              </w:rPr>
-              <w:t>良好</w:t>
-            </w:r>
-            <w:r>
-              <w:rPr>
-                <w:rFonts w:ascii="標楷體" w:eastAsia="標楷體" w:hAnsi="標楷體" w:hint="eastAsia"/>
-              </w:rPr>
-              <w:t>□</w:t>
-            </w:r>
-            <w:r>
-              <w:rPr>
-                <w:rFonts w:ascii="標楷體" w:eastAsia="標楷體" w:hAnsi="標楷體" w:hint="eastAsia"/>
-              </w:rPr>
-              <w:t>尚可□差</w:t>
-            </w:r>
-          </w:p>
-          <w:p>
-            <w:pPr>
-              <w:spacing w:line="400" w:lineRule="exact"/>
-              <w:ind w:left="32"/>
-              <w:jc w:val="both"/>
-              <w:rPr>
-                <w:rFonts w:ascii="標楷體" w:eastAsia="標楷體" w:hAnsi="標楷體"/>
-              </w:rPr>
-            </w:pPr>
-            <w:r>
-              <w:rPr>
-                <w:rFonts w:ascii="標楷體" w:eastAsia="標楷體" w:hAnsi="標楷體" w:hint="eastAsia"/>
-              </w:rPr>
-              <w:t xml:space="preserve">(8)家庭經濟狀況　     </w:t>
-            </w:r>
-            <w:r>
-              <w:rPr>
-                <w:rFonts w:ascii="標楷體" w:eastAsia="標楷體" w:hAnsi="標楷體" w:hint="eastAsia"/>
-              </w:rPr>
-              <w:t xml:space="preserve">     </w:t>
-            </w:r>
-            <w:r>
-              <w:rPr>
-                <w:rFonts w:ascii="標楷體" w:eastAsia="標楷體" w:hAnsi="標楷體" w:hint="eastAsia"/>
-              </w:rPr>
-              <w:t>□</w:t>
-            </w:r>
-            <w:r>
-              <w:rPr>
-                <w:rFonts w:ascii="標楷體" w:eastAsia="標楷體" w:hAnsi="標楷體" w:hint="eastAsia"/>
-              </w:rPr>
-              <w:t>良好</w:t>
-            </w:r>
-            <w:r>
-              <w:rPr>
-                <w:rFonts w:ascii="標楷體" w:eastAsia="標楷體" w:hAnsi="標楷體" w:hint="eastAsia"/>
-              </w:rPr>
-              <w:t>□</w:t>
-            </w:r>
-            <w:r>
-              <w:rPr>
-                <w:rFonts w:ascii="標楷體" w:eastAsia="標楷體" w:hAnsi="標楷體" w:hint="eastAsia"/>
-              </w:rPr>
-              <w:t>尚可□差</w:t>
             </w:r>
           </w:p>
         </w:tc>
@@ -1838,7 +1596,8 @@
             </w:pPr>
             <w:r>
               <w:rPr>
-                <w:rFonts w:ascii="標楷體" w:eastAsia="標楷體" w:hAnsi="標楷體" w:hint="eastAsia"/>
+                <w:rFonts w:ascii="DFKai-SB" w:eastAsia="標楷體" w:hAnsi="DFKai-SB" w:hint="eastAsia"/>
+                <w:sz w:val="24"/>
               </w:rPr>
               <w:t>現況分析</w:t>
             </w:r>
@@ -1859,629 +1618,19 @@
           </w:tcPr>
           <w:p>
             <w:pPr>
-              <w:spacing w:line="400" w:lineRule="exact"/>
-              <w:ind w:left="396" w:hangingChars="165" w:hanging="396"/>
-              <w:rPr>
-                <w:rFonts w:ascii="標楷體" w:eastAsia="標楷體" w:hAnsi="標楷體"/>
-              </w:rPr>
-            </w:pPr>
-            <w:r>
-              <w:rPr>
-                <w:rFonts w:ascii="標楷體" w:eastAsia="標楷體" w:hAnsi="標楷體" w:hint="eastAsia"/>
+              <w:spacing w:line="400" w:lineRule="exact" w:before="0" w:after="0"/>
+              <w:ind w:left="0" w:firstLine="0"/>
+              <w:rPr>
+                <w:rFonts w:ascii="標楷體" w:eastAsia="標楷體" w:hAnsi="標楷體"/>
+              </w:rPr>
+            </w:pPr>
+            <w:r>
+              <w:rPr>
+                <w:rFonts w:ascii="DFKai-SB" w:eastAsia="標楷體" w:hAnsi="DFKai-SB" w:hint="eastAsia"/>
+                <w:sz w:val="24"/>
               </w:rPr>
               <w:t>{analysisBlock}</w:t>
             </w:r>
-          </w:p>
-          <w:p>
-            <w:pPr>
-              <w:spacing w:line="400" w:lineRule="exact"/>
-              <w:ind w:left="396" w:hangingChars="165" w:hanging="396"/>
-              <w:rPr>
-                <w:rFonts w:ascii="標楷體" w:eastAsia="標楷體" w:hAnsi="標楷體"/>
-              </w:rPr>
-            </w:pPr>
-            <w:r>
-              <w:rPr>
-                <w:rFonts w:ascii="標楷體" w:eastAsia="標楷體" w:hAnsi="標楷體" w:hint="eastAsia"/>
-              </w:rPr>
-              <w:t>(2)</w:t>
-            </w:r>
-            <w:r>
-              <w:rPr>
-                <w:rFonts w:ascii="標楷體" w:eastAsia="標楷體" w:hAnsi="標楷體"/>
-              </w:rPr>
-              <w:t>職(學)業能力</w:t>
-            </w:r>
-            <w:r>
-              <w:rPr>
-                <w:rFonts w:ascii="標楷體" w:eastAsia="標楷體" w:hAnsi="標楷體" w:hint="eastAsia"/>
-              </w:rPr>
-              <w:t xml:space="preserve">　</w:t>
-            </w:r>
-            <w:r>
-              <w:rPr>
-                <w:rFonts w:ascii="標楷體" w:eastAsia="標楷體" w:hAnsi="標楷體" w:hint="eastAsia"/>
-              </w:rPr>
-              <w:t>□</w:t>
-            </w:r>
-            <w:r>
-              <w:rPr>
-                <w:rFonts w:ascii="標楷體" w:eastAsia="標楷體" w:hAnsi="標楷體"/>
-              </w:rPr>
-              <w:t>無需協助</w:t>
-            </w:r>
-            <w:r>
-              <w:rPr>
-                <w:rFonts w:ascii="標楷體" w:eastAsia="標楷體" w:hAnsi="標楷體" w:hint="eastAsia"/>
-              </w:rPr>
-              <w:t>□</w:t>
-            </w:r>
-            <w:r>
-              <w:rPr>
-                <w:rFonts w:ascii="標楷體" w:eastAsia="標楷體" w:hAnsi="標楷體"/>
-              </w:rPr>
-              <w:t>需部份協助</w:t>
-            </w:r>
-            <w:r>
-              <w:rPr>
-                <w:rFonts w:ascii="標楷體" w:eastAsia="標楷體" w:hAnsi="標楷體" w:hint="eastAsia"/>
-              </w:rPr>
-              <w:t>□</w:t>
-            </w:r>
-            <w:r>
-              <w:rPr>
-                <w:rFonts w:ascii="標楷體" w:eastAsia="標楷體" w:hAnsi="標楷體"/>
-              </w:rPr>
-              <w:t>完全需要協</w:t>
-            </w:r>
-            <w:r>
-              <w:rPr>
-                <w:rFonts w:ascii="標楷體" w:eastAsia="標楷體" w:hAnsi="標楷體" w:hint="eastAsia"/>
-              </w:rPr>
-              <w:t>助□</w:t>
-            </w:r>
-            <w:r>
-              <w:rPr>
-                <w:rFonts w:ascii="標楷體" w:eastAsia="標楷體" w:hAnsi="標楷體"/>
-              </w:rPr>
-              <w:t>本項不適用</w:t>
-            </w:r>
-          </w:p>
-          <w:p>
-            <w:pPr>
-              <w:spacing w:line="400" w:lineRule="exact"/>
-              <w:ind w:left="396" w:hangingChars="165" w:hanging="396"/>
-              <w:rPr>
-                <w:rFonts w:ascii="標楷體" w:eastAsia="標楷體" w:hAnsi="標楷體"/>
-              </w:rPr>
-            </w:pPr>
-            <w:r>
-              <w:rPr>
-                <w:rFonts w:ascii="標楷體" w:eastAsia="標楷體" w:hAnsi="標楷體" w:hint="eastAsia"/>
-              </w:rPr>
-              <w:t>(3)</w:t>
-            </w:r>
-            <w:r>
-              <w:rPr>
-                <w:rFonts w:ascii="標楷體" w:eastAsia="標楷體" w:hAnsi="標楷體"/>
-              </w:rPr>
-              <w:t>行動能力</w:t>
-            </w:r>
-            <w:r>
-              <w:rPr>
-                <w:rFonts w:ascii="標楷體" w:eastAsia="標楷體" w:hAnsi="標楷體" w:hint="eastAsia"/>
-              </w:rPr>
-              <w:t xml:space="preserve">　</w:t>
-            </w:r>
-            <w:r>
-              <w:rPr>
-                <w:rFonts w:ascii="標楷體" w:eastAsia="標楷體" w:hAnsi="標楷體" w:hint="eastAsia"/>
-              </w:rPr>
-              <w:t>□</w:t>
-            </w:r>
-            <w:r>
-              <w:rPr>
-                <w:rFonts w:ascii="標楷體" w:eastAsia="標楷體" w:hAnsi="標楷體"/>
-              </w:rPr>
-              <w:t>無需協助</w:t>
-            </w:r>
-            <w:r>
-              <w:rPr>
-                <w:rFonts w:ascii="標楷體" w:eastAsia="標楷體" w:hAnsi="標楷體" w:hint="eastAsia"/>
-              </w:rPr>
-              <w:t>□</w:t>
-            </w:r>
-            <w:r>
-              <w:rPr>
-                <w:rFonts w:ascii="標楷體" w:eastAsia="標楷體" w:hAnsi="標楷體"/>
-              </w:rPr>
-              <w:t>需部份協助</w:t>
-            </w:r>
-            <w:r>
-              <w:rPr>
-                <w:rFonts w:ascii="標楷體" w:eastAsia="標楷體" w:hAnsi="標楷體" w:hint="eastAsia"/>
-              </w:rPr>
-              <w:t>□</w:t>
-            </w:r>
-            <w:r>
-              <w:rPr>
-                <w:rFonts w:ascii="標楷體" w:eastAsia="標楷體" w:hAnsi="標楷體"/>
-              </w:rPr>
-              <w:t>完全需要協</w:t>
-            </w:r>
-            <w:r>
-              <w:rPr>
-                <w:rFonts w:ascii="標楷體" w:eastAsia="標楷體" w:hAnsi="標楷體" w:hint="eastAsia"/>
-              </w:rPr>
-              <w:t>助□</w:t>
-            </w:r>
-            <w:r>
-              <w:rPr>
-                <w:rFonts w:ascii="標楷體" w:eastAsia="標楷體" w:hAnsi="標楷體"/>
-              </w:rPr>
-              <w:t>本項不適用</w:t>
-            </w:r>
-          </w:p>
-          <w:p>
-            <w:pPr>
-              <w:spacing w:line="400" w:lineRule="exact"/>
-              <w:ind w:left="396" w:hangingChars="165" w:hanging="396"/>
-              <w:rPr>
-                <w:rFonts w:ascii="標楷體" w:eastAsia="標楷體" w:hAnsi="標楷體"/>
-              </w:rPr>
-            </w:pPr>
-            <w:r>
-              <w:rPr>
-                <w:rFonts w:ascii="標楷體" w:eastAsia="標楷體" w:hAnsi="標楷體" w:hint="eastAsia"/>
-              </w:rPr>
-              <w:t>(4)</w:t>
-            </w:r>
-            <w:r>
-              <w:rPr>
-                <w:rFonts w:ascii="標楷體" w:eastAsia="標楷體" w:hAnsi="標楷體"/>
-              </w:rPr>
-              <w:t>交通能力</w:t>
-            </w:r>
-            <w:r>
-              <w:rPr>
-                <w:rFonts w:ascii="標楷體" w:eastAsia="標楷體" w:hAnsi="標楷體" w:hint="eastAsia"/>
-              </w:rPr>
-              <w:t xml:space="preserve">　</w:t>
-            </w:r>
-            <w:r>
-              <w:rPr>
-                <w:rFonts w:ascii="標楷體" w:eastAsia="標楷體" w:hAnsi="標楷體" w:hint="eastAsia"/>
-              </w:rPr>
-              <w:t>□</w:t>
-            </w:r>
-            <w:r>
-              <w:rPr>
-                <w:rFonts w:ascii="標楷體" w:eastAsia="標楷體" w:hAnsi="標楷體"/>
-              </w:rPr>
-              <w:t>無需協助</w:t>
-            </w:r>
-            <w:r>
-              <w:rPr>
-                <w:rFonts w:ascii="標楷體" w:eastAsia="標楷體" w:hAnsi="標楷體" w:hint="eastAsia"/>
-              </w:rPr>
-              <w:t>□</w:t>
-            </w:r>
-            <w:r>
-              <w:rPr>
-                <w:rFonts w:ascii="標楷體" w:eastAsia="標楷體" w:hAnsi="標楷體"/>
-              </w:rPr>
-              <w:t>需部份協助</w:t>
-            </w:r>
-            <w:r>
-              <w:rPr>
-                <w:rFonts w:ascii="標楷體" w:eastAsia="標楷體" w:hAnsi="標楷體" w:hint="eastAsia"/>
-              </w:rPr>
-              <w:t>□</w:t>
-            </w:r>
-            <w:r>
-              <w:rPr>
-                <w:rFonts w:ascii="標楷體" w:eastAsia="標楷體" w:hAnsi="標楷體"/>
-              </w:rPr>
-              <w:t>完全需要協</w:t>
-            </w:r>
-            <w:r>
-              <w:rPr>
-                <w:rFonts w:ascii="標楷體" w:eastAsia="標楷體" w:hAnsi="標楷體" w:hint="eastAsia"/>
-              </w:rPr>
-              <w:t>助□</w:t>
-            </w:r>
-            <w:r>
-              <w:rPr>
-                <w:rFonts w:ascii="標楷體" w:eastAsia="標楷體" w:hAnsi="標楷體"/>
-              </w:rPr>
-              <w:t>本項不適用</w:t>
-            </w:r>
-          </w:p>
-          <w:p>
-            <w:pPr>
-              <w:spacing w:line="400" w:lineRule="exact"/>
-              <w:ind w:left="396" w:hangingChars="165" w:hanging="396"/>
-              <w:rPr>
-                <w:rFonts w:ascii="標楷體" w:eastAsia="標楷體" w:hAnsi="標楷體"/>
-              </w:rPr>
-            </w:pPr>
-            <w:r>
-              <w:rPr>
-                <w:rFonts w:ascii="標楷體" w:eastAsia="標楷體" w:hAnsi="標楷體" w:hint="eastAsia"/>
-              </w:rPr>
-              <w:t>(5)</w:t>
-            </w:r>
-            <w:r>
-              <w:rPr>
-                <w:rFonts w:ascii="標楷體" w:eastAsia="標楷體" w:hAnsi="標楷體"/>
-              </w:rPr>
-              <w:t>通訊能力</w:t>
-            </w:r>
-            <w:r>
-              <w:rPr>
-                <w:rFonts w:ascii="標楷體" w:eastAsia="標楷體" w:hAnsi="標楷體" w:hint="eastAsia"/>
-              </w:rPr>
-              <w:t xml:space="preserve">　</w:t>
-            </w:r>
-            <w:r>
-              <w:rPr>
-                <w:rFonts w:ascii="標楷體" w:eastAsia="標楷體" w:hAnsi="標楷體" w:hint="eastAsia"/>
-              </w:rPr>
-              <w:t>□</w:t>
-            </w:r>
-            <w:r>
-              <w:rPr>
-                <w:rFonts w:ascii="標楷體" w:eastAsia="標楷體" w:hAnsi="標楷體"/>
-              </w:rPr>
-              <w:t>無需協助</w:t>
-            </w:r>
-            <w:r>
-              <w:rPr>
-                <w:rFonts w:ascii="標楷體" w:eastAsia="標楷體" w:hAnsi="標楷體" w:hint="eastAsia"/>
-              </w:rPr>
-              <w:t>□</w:t>
-            </w:r>
-            <w:r>
-              <w:rPr>
-                <w:rFonts w:ascii="標楷體" w:eastAsia="標楷體" w:hAnsi="標楷體"/>
-              </w:rPr>
-              <w:t>需部份協助</w:t>
-            </w:r>
-            <w:r>
-              <w:rPr>
-                <w:rFonts w:ascii="標楷體" w:eastAsia="標楷體" w:hAnsi="標楷體" w:hint="eastAsia"/>
-              </w:rPr>
-              <w:t>□</w:t>
-            </w:r>
-            <w:r>
-              <w:rPr>
-                <w:rFonts w:ascii="標楷體" w:eastAsia="標楷體" w:hAnsi="標楷體"/>
-              </w:rPr>
-              <w:t>完全需要協</w:t>
-            </w:r>
-            <w:r>
-              <w:rPr>
-                <w:rFonts w:ascii="標楷體" w:eastAsia="標楷體" w:hAnsi="標楷體" w:hint="eastAsia"/>
-              </w:rPr>
-              <w:t>助□</w:t>
-            </w:r>
-            <w:r>
-              <w:rPr>
-                <w:rFonts w:ascii="標楷體" w:eastAsia="標楷體" w:hAnsi="標楷體"/>
-              </w:rPr>
-              <w:t>本項不適用</w:t>
-            </w:r>
-          </w:p>
-          <w:p>
-            <w:pPr>
-              <w:spacing w:line="400" w:lineRule="exact"/>
-              <w:ind w:left="396" w:hangingChars="165" w:hanging="396"/>
-              <w:rPr>
-                <w:rFonts w:ascii="標楷體" w:eastAsia="標楷體" w:hAnsi="標楷體"/>
-              </w:rPr>
-            </w:pPr>
-            <w:r>
-              <w:rPr>
-                <w:rFonts w:ascii="標楷體" w:eastAsia="標楷體" w:hAnsi="標楷體" w:hint="eastAsia"/>
-              </w:rPr>
-              <w:t>(6)</w:t>
-            </w:r>
-            <w:r>
-              <w:rPr>
-                <w:rFonts w:ascii="標楷體" w:eastAsia="標楷體" w:hAnsi="標楷體"/>
-              </w:rPr>
-              <w:t>認知理解能力</w:t>
-            </w:r>
-            <w:r>
-              <w:rPr>
-                <w:rFonts w:ascii="標楷體" w:eastAsia="標楷體" w:hAnsi="標楷體" w:hint="eastAsia"/>
-              </w:rPr>
-              <w:t xml:space="preserve">　</w:t>
-            </w:r>
-            <w:r>
-              <w:rPr>
-                <w:rFonts w:ascii="標楷體" w:eastAsia="標楷體" w:hAnsi="標楷體" w:hint="eastAsia"/>
-              </w:rPr>
-              <w:t>□</w:t>
-            </w:r>
-            <w:r>
-              <w:rPr>
-                <w:rFonts w:ascii="標楷體" w:eastAsia="標楷體" w:hAnsi="標楷體"/>
-              </w:rPr>
-              <w:t>完全能理解</w:t>
-            </w:r>
-            <w:r>
-              <w:rPr>
-                <w:rFonts w:ascii="標楷體" w:eastAsia="標楷體" w:hAnsi="標楷體" w:hint="eastAsia"/>
-              </w:rPr>
-              <w:t>□</w:t>
-            </w:r>
-            <w:r>
-              <w:rPr>
-                <w:rFonts w:ascii="標楷體" w:eastAsia="標楷體" w:hAnsi="標楷體"/>
-              </w:rPr>
-              <w:t>部份能理解</w:t>
-            </w:r>
-            <w:r>
-              <w:rPr>
-                <w:rFonts w:ascii="標楷體" w:eastAsia="標楷體" w:hAnsi="標楷體" w:hint="eastAsia"/>
-              </w:rPr>
-              <w:t>□</w:t>
-            </w:r>
-            <w:r>
-              <w:rPr>
-                <w:rFonts w:ascii="標楷體" w:eastAsia="標楷體" w:hAnsi="標楷體"/>
-              </w:rPr>
-              <w:t>完全不能理解</w:t>
-            </w:r>
-            <w:r>
-              <w:rPr>
-                <w:rFonts w:ascii="標楷體" w:eastAsia="標楷體" w:hAnsi="標楷體" w:hint="eastAsia"/>
-              </w:rPr>
-              <w:t>□</w:t>
-            </w:r>
-            <w:r>
-              <w:rPr>
-                <w:rFonts w:ascii="標楷體" w:eastAsia="標楷體" w:hAnsi="標楷體"/>
-              </w:rPr>
-              <w:t>本項不適用</w:t>
-            </w:r>
-          </w:p>
-          <w:p>
-            <w:pPr>
-              <w:spacing w:line="400" w:lineRule="exact"/>
-              <w:ind w:left="396" w:hangingChars="165" w:hanging="396"/>
-              <w:rPr>
-                <w:rFonts w:ascii="標楷體" w:eastAsia="標楷體" w:hAnsi="標楷體"/>
-              </w:rPr>
-            </w:pPr>
-            <w:r>
-              <w:rPr>
-                <w:rFonts w:ascii="標楷體" w:eastAsia="標楷體" w:hAnsi="標楷體" w:hint="eastAsia"/>
-              </w:rPr>
-              <w:t>(7)</w:t>
-            </w:r>
-            <w:r>
-              <w:rPr>
-                <w:rFonts w:ascii="標楷體" w:eastAsia="標楷體" w:hAnsi="標楷體"/>
-              </w:rPr>
-              <w:t>語言表達能力</w:t>
-            </w:r>
-            <w:r>
-              <w:rPr>
-                <w:rFonts w:ascii="標楷體" w:eastAsia="標楷體" w:hAnsi="標楷體" w:hint="eastAsia"/>
-              </w:rPr>
-              <w:t xml:space="preserve">　</w:t>
-            </w:r>
-            <w:r>
-              <w:rPr>
-                <w:rFonts w:ascii="標楷體" w:eastAsia="標楷體" w:hAnsi="標楷體" w:hint="eastAsia"/>
-              </w:rPr>
-              <w:t>□</w:t>
-            </w:r>
-            <w:r>
-              <w:rPr>
-                <w:rFonts w:ascii="標楷體" w:eastAsia="標楷體" w:hAnsi="標楷體"/>
-              </w:rPr>
-              <w:t>完全能表達</w:t>
-            </w:r>
-            <w:r>
-              <w:rPr>
-                <w:rFonts w:ascii="標楷體" w:eastAsia="標楷體" w:hAnsi="標楷體" w:hint="eastAsia"/>
-              </w:rPr>
-              <w:t>□</w:t>
-            </w:r>
-            <w:r>
-              <w:rPr>
-                <w:rFonts w:ascii="標楷體" w:eastAsia="標楷體" w:hAnsi="標楷體"/>
-              </w:rPr>
-              <w:t>部份能表達</w:t>
-            </w:r>
-            <w:r>
-              <w:rPr>
-                <w:rFonts w:ascii="標楷體" w:eastAsia="標楷體" w:hAnsi="標楷體" w:hint="eastAsia"/>
-              </w:rPr>
-              <w:t>□</w:t>
-            </w:r>
-            <w:r>
-              <w:rPr>
-                <w:rFonts w:ascii="標楷體" w:eastAsia="標楷體" w:hAnsi="標楷體"/>
-              </w:rPr>
-              <w:t>完全不能表達</w:t>
-            </w:r>
-            <w:r>
-              <w:rPr>
-                <w:rFonts w:ascii="標楷體" w:eastAsia="標楷體" w:hAnsi="標楷體" w:hint="eastAsia"/>
-              </w:rPr>
-              <w:t>□</w:t>
-            </w:r>
-            <w:r>
-              <w:rPr>
-                <w:rFonts w:ascii="標楷體" w:eastAsia="標楷體" w:hAnsi="標楷體"/>
-              </w:rPr>
-              <w:t>本項不適用</w:t>
-            </w:r>
-          </w:p>
-          <w:p>
-            <w:pPr>
-              <w:spacing w:line="400" w:lineRule="exact"/>
-              <w:ind w:left="396" w:hangingChars="165" w:hanging="396"/>
-              <w:rPr>
-                <w:rFonts w:ascii="標楷體" w:eastAsia="標楷體" w:hAnsi="標楷體"/>
-              </w:rPr>
-            </w:pPr>
-            <w:r>
-              <w:rPr>
-                <w:rFonts w:ascii="標楷體" w:eastAsia="標楷體" w:hAnsi="標楷體" w:hint="eastAsia"/>
-              </w:rPr>
-              <w:t>(8)</w:t>
-            </w:r>
-            <w:r>
-              <w:rPr>
-                <w:rFonts w:ascii="標楷體" w:eastAsia="標楷體" w:hAnsi="標楷體"/>
-              </w:rPr>
-              <w:t>人際互動能力</w:t>
-            </w:r>
-            <w:r>
-              <w:rPr>
-                <w:rFonts w:ascii="標楷體" w:eastAsia="標楷體" w:hAnsi="標楷體" w:hint="eastAsia"/>
-              </w:rPr>
-              <w:t xml:space="preserve">　</w:t>
-            </w:r>
-            <w:r>
-              <w:rPr>
-                <w:rFonts w:ascii="標楷體" w:eastAsia="標楷體" w:hAnsi="標楷體" w:hint="eastAsia"/>
-              </w:rPr>
-              <w:t>□</w:t>
-            </w:r>
-            <w:r>
-              <w:rPr>
-                <w:rFonts w:ascii="標楷體" w:eastAsia="標楷體" w:hAnsi="標楷體"/>
-              </w:rPr>
-              <w:t>能力良好</w:t>
-            </w:r>
-            <w:r>
-              <w:rPr>
-                <w:rFonts w:ascii="標楷體" w:eastAsia="標楷體" w:hAnsi="標楷體" w:hint="eastAsia"/>
-              </w:rPr>
-              <w:t>□</w:t>
-            </w:r>
-            <w:r>
-              <w:rPr>
-                <w:rFonts w:ascii="標楷體" w:eastAsia="標楷體" w:hAnsi="標楷體"/>
-              </w:rPr>
-              <w:t>能力尚可</w:t>
-            </w:r>
-            <w:r>
-              <w:rPr>
-                <w:rFonts w:ascii="標楷體" w:eastAsia="標楷體" w:hAnsi="標楷體" w:hint="eastAsia"/>
-              </w:rPr>
-              <w:t>□</w:t>
-            </w:r>
-            <w:r>
-              <w:rPr>
-                <w:rFonts w:ascii="標楷體" w:eastAsia="標楷體" w:hAnsi="標楷體"/>
-              </w:rPr>
-              <w:t>完全不能理解</w:t>
-            </w:r>
-            <w:r>
-              <w:rPr>
-                <w:rFonts w:ascii="標楷體" w:eastAsia="標楷體" w:hAnsi="標楷體" w:hint="eastAsia"/>
-              </w:rPr>
-              <w:t>□</w:t>
-            </w:r>
-            <w:r>
-              <w:rPr>
-                <w:rFonts w:ascii="標楷體" w:eastAsia="標楷體" w:hAnsi="標楷體"/>
-              </w:rPr>
-              <w:t>本項不適用</w:t>
-            </w:r>
-          </w:p>
-          <w:p>
-            <w:pPr>
-              <w:spacing w:line="400" w:lineRule="exact"/>
-              <w:ind w:left="32"/>
-              <w:jc w:val="both"/>
-              <w:rPr>
-                <w:rFonts w:ascii="標楷體" w:eastAsia="標楷體" w:hAnsi="標楷體"/>
-              </w:rPr>
-            </w:pPr>
-            <w:r>
-              <w:rPr>
-                <w:rFonts w:ascii="標楷體" w:eastAsia="標楷體" w:hAnsi="標楷體" w:hint="eastAsia"/>
-              </w:rPr>
-              <w:t>(9)</w:t>
-            </w:r>
-            <w:r>
-              <w:rPr>
-                <w:rFonts w:ascii="標楷體" w:eastAsia="標楷體" w:hAnsi="標楷體"/>
-              </w:rPr>
-              <w:t>休閒能力</w:t>
-            </w:r>
-            <w:r>
-              <w:rPr>
-                <w:rFonts w:ascii="標楷體" w:eastAsia="標楷體" w:hAnsi="標楷體" w:hint="eastAsia"/>
-              </w:rPr>
-              <w:t xml:space="preserve">　</w:t>
-            </w:r>
-            <w:r>
-              <w:rPr>
-                <w:rFonts w:ascii="標楷體" w:eastAsia="標楷體" w:hAnsi="標楷體" w:hint="eastAsia"/>
-              </w:rPr>
-              <w:t>□</w:t>
-            </w:r>
-            <w:r>
-              <w:rPr>
-                <w:rFonts w:ascii="標楷體" w:eastAsia="標楷體" w:hAnsi="標楷體"/>
-              </w:rPr>
-              <w:t>能自行參與</w:t>
-            </w:r>
-            <w:r>
-              <w:rPr>
-                <w:rFonts w:ascii="標楷體" w:eastAsia="標楷體" w:hAnsi="標楷體" w:hint="eastAsia"/>
-              </w:rPr>
-              <w:t>□</w:t>
-            </w:r>
-            <w:r>
-              <w:rPr>
-                <w:rFonts w:ascii="標楷體" w:eastAsia="標楷體" w:hAnsi="標楷體"/>
-              </w:rPr>
-              <w:t>部份能參與</w:t>
-            </w:r>
-            <w:r>
-              <w:rPr>
-                <w:rFonts w:ascii="標楷體" w:eastAsia="標楷體" w:hAnsi="標楷體" w:hint="eastAsia"/>
-              </w:rPr>
-              <w:t>□</w:t>
-            </w:r>
-            <w:r>
-              <w:rPr>
-                <w:rFonts w:ascii="標楷體" w:eastAsia="標楷體" w:hAnsi="標楷體"/>
-              </w:rPr>
-              <w:t>完全無法參與</w:t>
-            </w:r>
-            <w:r>
-              <w:rPr>
-                <w:rFonts w:ascii="標楷體" w:eastAsia="標楷體" w:hAnsi="標楷體" w:hint="eastAsia"/>
-              </w:rPr>
-              <w:t>□</w:t>
-            </w:r>
-            <w:r>
-              <w:rPr>
-                <w:rFonts w:ascii="標楷體" w:eastAsia="標楷體" w:hAnsi="標楷體"/>
-              </w:rPr>
-              <w:t>本項不適用</w:t>
-            </w:r>
-          </w:p>
-          <w:p>
-            <w:pPr>
-              <w:spacing w:line="400" w:lineRule="exact"/>
-              <w:ind w:left="32"/>
-              <w:jc w:val="both"/>
-              <w:rPr>
-                <w:rFonts w:ascii="標楷體" w:eastAsia="標楷體" w:hAnsi="標楷體"/>
-              </w:rPr>
-            </w:pPr>
           </w:p>
         </w:tc>
       </w:tr>
@@ -2535,7 +1684,8 @@
             </w:pPr>
             <w:r>
               <w:rPr>
-                <w:rFonts w:ascii="標楷體" w:eastAsia="標楷體" w:hAnsi="標楷體" w:hint="eastAsia"/>
+                <w:rFonts w:ascii="DFKai-SB" w:eastAsia="標楷體" w:hAnsi="DFKai-SB" w:hint="eastAsia"/>
+                <w:sz w:val="24"/>
               </w:rPr>
               <w:t>學生</w:t>
             </w:r>
@@ -2552,7 +1702,8 @@
             </w:pPr>
             <w:r>
               <w:rPr>
-                <w:rFonts w:ascii="標楷體" w:eastAsia="標楷體" w:hAnsi="標楷體" w:hint="eastAsia"/>
+                <w:rFonts w:ascii="DFKai-SB" w:eastAsia="標楷體" w:hAnsi="DFKai-SB" w:hint="eastAsia"/>
+                <w:sz w:val="24"/>
               </w:rPr>
               <w:t>需求評估</w:t>
             </w:r>
@@ -2580,6 +1731,10 @@
               </w:rPr>
             </w:pPr>
             <w:r>
+              <w:rPr>
+                <w:rFonts w:ascii="DFKai-SB" w:hAnsi="DFKai-SB" w:eastAsia="標楷體"/>
+                <w:sz w:val="24"/>
+              </w:rPr>
               <w:t>{studentNeedsAssessment}</w:t>
             </w:r>
           </w:p>
@@ -2634,7 +1789,8 @@
             </w:pPr>
             <w:r>
               <w:rPr>
-                <w:rFonts w:ascii="標楷體" w:eastAsia="標楷體" w:hAnsi="標楷體" w:hint="eastAsia"/>
+                <w:rFonts w:ascii="DFKai-SB" w:eastAsia="標楷體" w:hAnsi="DFKai-SB" w:hint="eastAsia"/>
+                <w:sz w:val="24"/>
               </w:rPr>
               <w:t>特教支持服務及策略</w:t>
             </w:r>
@@ -2663,6 +1819,10 @@
               </w:rPr>
             </w:pPr>
             <w:r>
+              <w:rPr>
+                <w:rFonts w:ascii="DFKai-SB" w:hAnsi="DFKai-SB" w:eastAsia="標楷體"/>
+                <w:sz w:val="24"/>
+              </w:rPr>
               <w:t>{serviceEvaluationSummary}</w:t>
             </w:r>
           </w:p>
@@ -2717,7 +1877,8 @@
             </w:pPr>
             <w:r>
               <w:rPr>
-                <w:rFonts w:ascii="標楷體" w:eastAsia="標楷體" w:hAnsi="標楷體" w:hint="eastAsia"/>
+                <w:rFonts w:ascii="DFKai-SB" w:eastAsia="標楷體" w:hAnsi="DFKai-SB" w:hint="eastAsia"/>
+                <w:sz w:val="24"/>
               </w:rPr>
               <w:t>其他</w:t>
             </w:r>
@@ -2746,6 +1907,10 @@
               </w:rPr>
             </w:pPr>
             <w:r>
+              <w:rPr>
+                <w:rFonts w:ascii="DFKai-SB" w:hAnsi="DFKai-SB" w:eastAsia="標楷體"/>
+                <w:sz w:val="24"/>
+              </w:rPr>
               <w:t>{semesterOther}</w:t>
             </w:r>
           </w:p>
@@ -2784,15 +1949,17 @@
             </w:pPr>
             <w:r>
               <w:rPr>
-                <w:rFonts w:ascii="標楷體" w:eastAsia="標楷體" w:hAnsi="標楷體" w:hint="eastAsia"/>
+                <w:rFonts w:ascii="DFKai-SB" w:eastAsia="標楷體" w:hAnsi="DFKai-SB" w:hint="eastAsia"/>
                 <w:b/>
+                <w:sz w:val="24"/>
               </w:rPr>
               <w:t>資</w:t>
             </w:r>
             <w:r>
               <w:rPr>
-                <w:rFonts w:ascii="標楷體" w:eastAsia="標楷體" w:hAnsi="標楷體"/>
+                <w:rFonts w:ascii="DFKai-SB" w:eastAsia="標楷體" w:hAnsi="DFKai-SB"/>
                 <w:b/>
+                <w:sz w:val="24"/>
               </w:rPr>
               <w:t>源教室</w:t>
             </w:r>
@@ -2810,22 +1977,25 @@
             </w:pPr>
             <w:r>
               <w:rPr>
-                <w:rFonts w:ascii="標楷體" w:eastAsia="標楷體" w:hAnsi="標楷體" w:hint="eastAsia"/>
+                <w:rFonts w:ascii="DFKai-SB" w:eastAsia="標楷體" w:hAnsi="DFKai-SB" w:hint="eastAsia"/>
                 <w:b/>
+                <w:sz w:val="24"/>
               </w:rPr>
               <w:t>輔</w:t>
             </w:r>
             <w:r>
               <w:rPr>
-                <w:rFonts w:ascii="標楷體" w:eastAsia="標楷體" w:hAnsi="標楷體"/>
+                <w:rFonts w:ascii="DFKai-SB" w:eastAsia="標楷體" w:hAnsi="DFKai-SB"/>
                 <w:b/>
+                <w:sz w:val="24"/>
               </w:rPr>
               <w:t>導人員</w:t>
             </w:r>
             <w:r>
               <w:rPr>
-                <w:rFonts w:ascii="標楷體" w:eastAsia="標楷體" w:hAnsi="標楷體" w:hint="eastAsia"/>
+                <w:rFonts w:ascii="DFKai-SB" w:eastAsia="標楷體" w:hAnsi="DFKai-SB" w:hint="eastAsia"/>
                 <w:b/>
+                <w:sz w:val="24"/>
               </w:rPr>
               <w:t>簽章</w:t>
             </w:r>
@@ -2857,8 +2027,9 @@
             </w:pPr>
             <w:r>
               <w:rPr>
-                <w:rFonts w:ascii="標楷體" w:eastAsia="標楷體" w:hAnsi="標楷體" w:hint="eastAsia"/>
+                <w:rFonts w:ascii="DFKai-SB" w:eastAsia="標楷體" w:hAnsi="DFKai-SB" w:hint="eastAsia"/>
                 <w:b/>
+                <w:sz w:val="24"/>
               </w:rPr>
               <w:t>諮商中心主任簽章</w:t>
             </w:r>
@@ -3024,37 +2195,43 @@
     </w:pPr>
     <w:r>
       <w:rPr>
-        <w:rFonts w:hint="eastAsia"/>
+        <w:rFonts w:hint="eastAsia" w:ascii="DFKai-SB" w:hAnsi="DFKai-SB" w:eastAsia="標楷體"/>
+        <w:sz w:val="24"/>
       </w:rPr>
       <w:t>明新學校財團法人</w:t>
     </w:r>
     <w:r>
       <w:rPr>
-        <w:rFonts w:hint="eastAsia"/>
+        <w:rFonts w:hint="eastAsia" w:ascii="DFKai-SB" w:hAnsi="DFKai-SB" w:eastAsia="標楷體"/>
+        <w:sz w:val="24"/>
       </w:rPr>
       <w:t>明新科技大學</w:t>
     </w:r>
     <w:r>
       <w:rPr>
-        <w:rFonts w:hint="eastAsia"/>
+        <w:rFonts w:hint="eastAsia" w:ascii="DFKai-SB" w:hAnsi="DFKai-SB" w:eastAsia="標楷體"/>
+        <w:sz w:val="24"/>
       </w:rPr>
       <w:t xml:space="preserve"> </w:t>
     </w:r>
     <w:r>
       <w:rPr>
-        <w:rFonts w:hint="eastAsia"/>
+        <w:rFonts w:hint="eastAsia" w:ascii="DFKai-SB" w:hAnsi="DFKai-SB" w:eastAsia="標楷體"/>
+        <w:sz w:val="24"/>
       </w:rPr>
       <w:t>諮商輔導暨職涯發展中心</w:t>
     </w:r>
     <w:r>
       <w:rPr>
-        <w:rFonts w:hint="eastAsia"/>
+        <w:rFonts w:hint="eastAsia" w:ascii="DFKai-SB" w:hAnsi="DFKai-SB" w:eastAsia="標楷體"/>
+        <w:sz w:val="24"/>
       </w:rPr>
       <w:t xml:space="preserve"> </w:t>
     </w:r>
     <w:r>
       <w:rPr>
-        <w:rFonts w:hint="eastAsia"/>
+        <w:rFonts w:hint="eastAsia" w:ascii="DFKai-SB" w:hAnsi="DFKai-SB" w:eastAsia="標楷體"/>
+        <w:sz w:val="24"/>
       </w:rPr>
       <w:t>資源教室</w:t>
     </w:r>
@@ -4015,7 +3192,8 @@
       <w:widowControl w:val="0"/>
     </w:pPr>
     <w:rPr>
-      <w:rFonts w:ascii="Calibri" w:eastAsia="新細明體" w:hAnsi="Calibri" w:cs="Times New Roman"/>
+      <w:rFonts w:ascii="標楷體" w:eastAsia="標楷體" w:hAnsi="標楷體" w:cs="Times New Roman"/>
+      <w:sz w:val="24"/>
     </w:rPr>
   </w:style>
   <w:style w:type="character" w:default="1" w:styleId="a0">

</xml_diff>

<commit_message>
feat: refine semester ISP assessments and strategies v1.6.2
</commit_message>
<xml_diff>
--- a/templates/semester-isp-template.docx
+++ b/templates/semester-isp-template.docx
@@ -1627,7 +1627,7 @@
             <w:r>
               <w:rPr>
                 <w:rFonts w:ascii="DFKai-SB" w:eastAsia="標楷體" w:hAnsi="DFKai-SB" w:hint="eastAsia"/>
-                <w:sz w:val="24"/>
+                <w:sz w:val="22"/>
               </w:rPr>
               <w:t>{analysisBlock}</w:t>
             </w:r>
@@ -1823,7 +1823,30 @@
                 <w:rFonts w:ascii="DFKai-SB" w:hAnsi="DFKai-SB" w:eastAsia="標楷體"/>
                 <w:sz w:val="24"/>
               </w:rPr>
-              <w:t>{serviceEvaluationSummary}</w:t>
+              <w:t>{#supportItems}</w:t>
+            </w:r>
+          </w:p>
+          <w:p>
+            <w:pPr>
+              <w:spacing w:before="0" w:after="0" w:lineRule="exact" w:line="400"/>
+              <w:ind w:left="420" w:hanging="420"/>
+              <w:jc w:val="both"/>
+            </w:pPr>
+            <w:r>
+              <w:rPr>
+                <w:rFonts w:ascii="DFKai-SB" w:hAnsi="DFKai-SB" w:eastAsia="標楷體"/>
+                <w:sz w:val="24"/>
+              </w:rPr>
+              <w:t>{text}</w:t>
+            </w:r>
+          </w:p>
+          <w:p>
+            <w:r>
+              <w:rPr>
+                <w:rFonts w:ascii="DFKai-SB" w:hAnsi="DFKai-SB" w:eastAsia="標楷體"/>
+                <w:sz w:val="24"/>
+              </w:rPr>
+              <w:t>{/supportItems}</w:t>
             </w:r>
           </w:p>
         </w:tc>

</xml_diff>